<commit_message>
docs: bodega virtual con PLT-02 (HU-15, backend #59/PR #60, frontend #22/PR #23)
</commit_message>
<xml_diff>
--- a/Fase 2/Evidencias Proyecto/Documentación/13_plantillas/PLT-02_Contrato_Servicios_Bodega.docx
+++ b/Fase 2/Evidencias Proyecto/Documentación/13_plantillas/PLT-02_Contrato_Servicios_Bodega.docx
@@ -10556,7 +10556,7 @@
           <w:lang w:val="es-ES_tradnl" w:eastAsia="es-ES_tradnl"/>
           <w14:ligatures w14:val="none"/>
         </w:rPr>
-        <w:t xml:space="preserve"> AVENIDA MACUL # 4747 BD 21</w:t>
+        <w:t xml:space="preserve"> «BODEGA_DIRECCION»</w:t>
       </w:r>
       <w:r>
         <w:rPr>
@@ -10574,16 +10574,16 @@
           <w:lang w:val="es-ES_tradnl" w:eastAsia="es-ES_tradnl"/>
           <w14:ligatures w14:val="none"/>
         </w:rPr>
-        <w:t xml:space="preserve">COMUNA DE </w:t>
-      </w:r>
-      <w:r>
-        <w:rPr>
-          <w:rFonts w:ascii="Times New Roman" w:eastAsia="Times New Roman" w:hAnsi="Times New Roman" w:cs="Times New Roman"/>
-          <w:kern w:val="0"/>
-          <w:lang w:val="es-ES_tradnl" w:eastAsia="es-ES_tradnl"/>
-          <w14:ligatures w14:val="none"/>
-        </w:rPr>
-        <w:t xml:space="preserve"> </w:t>
+        <w:t xml:space="preserve">COMUNA DE «BODEGA_COMUNA»</w:t>
+      </w:r>
+      <w:r>
+        <w:rPr>
+          <w:rFonts w:ascii="Times New Roman" w:eastAsia="Times New Roman" w:hAnsi="Times New Roman" w:cs="Times New Roman"/>
+          <w:kern w:val="0"/>
+          <w:lang w:val="es-ES_tradnl" w:eastAsia="es-ES_tradnl"/>
+          <w14:ligatures w14:val="none"/>
+        </w:rPr>
+        <w:t xml:space="preserve"/>
       </w:r>
       <w:r>
         <w:rPr>
@@ -10594,7 +10594,7 @@
           <w:lang w:val="es-ES_tradnl" w:eastAsia="es-ES_tradnl"/>
           <w14:ligatures w14:val="none"/>
         </w:rPr>
-        <w:t>MACUL</w:t>
+        <w:t xml:space="preserve"/>
       </w:r>
       <w:r>
         <w:rPr>
@@ -10786,27 +10786,27 @@
           <w:lang w:val="es-ES_tradnl" w:eastAsia="es-ES_tradnl"/>
           <w14:ligatures w14:val="none"/>
         </w:rPr>
-        <w:t xml:space="preserve"> 323-09087-619</w:t>
-      </w:r>
-      <w:r>
-        <w:rPr>
-          <w:rFonts w:ascii="Times New Roman" w:eastAsia="Times New Roman" w:hAnsi="Times New Roman" w:cs="Times New Roman"/>
-          <w:b/>
-          <w:kern w:val="0"/>
-          <w:lang w:val="es-ES_tradnl" w:eastAsia="es-ES_tradnl"/>
-          <w14:ligatures w14:val="none"/>
-        </w:rPr>
-        <w:t>,</w:t>
-      </w:r>
-      <w:r>
-        <w:rPr>
-          <w:rFonts w:ascii="Times New Roman" w:eastAsia="Times New Roman" w:hAnsi="Times New Roman" w:cs="Times New Roman"/>
-          <w:b/>
-          <w:kern w:val="0"/>
-          <w:lang w:val="es-ES_tradnl" w:eastAsia="es-ES_tradnl"/>
-          <w14:ligatures w14:val="none"/>
-        </w:rPr>
-        <w:t xml:space="preserve"> </w:t>
+        <w:t xml:space="preserve"> «BODEGA_ROL_AVALUO»</w:t>
+      </w:r>
+      <w:r>
+        <w:rPr>
+          <w:rFonts w:ascii="Times New Roman" w:eastAsia="Times New Roman" w:hAnsi="Times New Roman" w:cs="Times New Roman"/>
+          <w:b/>
+          <w:kern w:val="0"/>
+          <w:lang w:val="es-ES_tradnl" w:eastAsia="es-ES_tradnl"/>
+          <w14:ligatures w14:val="none"/>
+        </w:rPr>
+        <w:t xml:space="preserve">, de «BODEGA_COMUNA».</w:t>
+      </w:r>
+      <w:r>
+        <w:rPr>
+          <w:rFonts w:ascii="Times New Roman" w:eastAsia="Times New Roman" w:hAnsi="Times New Roman" w:cs="Times New Roman"/>
+          <w:b/>
+          <w:kern w:val="0"/>
+          <w:lang w:val="es-ES_tradnl" w:eastAsia="es-ES_tradnl"/>
+          <w14:ligatures w14:val="none"/>
+        </w:rPr>
+        <w:t xml:space="preserve"/>
       </w:r>
       <w:r>
         <w:rPr>
@@ -10816,27 +10816,27 @@
           <w:lang w:val="es-ES_tradnl" w:eastAsia="es-ES_tradnl"/>
           <w14:ligatures w14:val="none"/>
         </w:rPr>
-        <w:t>de</w:t>
-      </w:r>
-      <w:r>
-        <w:rPr>
-          <w:rFonts w:ascii="Times New Roman" w:eastAsia="Times New Roman" w:hAnsi="Times New Roman" w:cs="Times New Roman"/>
-          <w:b/>
-          <w:kern w:val="0"/>
-          <w:lang w:val="es-ES_tradnl" w:eastAsia="es-ES_tradnl"/>
-          <w14:ligatures w14:val="none"/>
-        </w:rPr>
-        <w:t xml:space="preserve"> MACUL</w:t>
-      </w:r>
-      <w:r>
-        <w:rPr>
-          <w:rFonts w:ascii="Times New Roman" w:eastAsia="Times New Roman" w:hAnsi="Times New Roman" w:cs="Times New Roman"/>
-          <w:b/>
-          <w:kern w:val="0"/>
-          <w:lang w:val="es-ES_tradnl" w:eastAsia="es-ES_tradnl"/>
-          <w14:ligatures w14:val="none"/>
-        </w:rPr>
-        <w:t>.</w:t>
+        <w:t xml:space="preserve"/>
+      </w:r>
+      <w:r>
+        <w:rPr>
+          <w:rFonts w:ascii="Times New Roman" w:eastAsia="Times New Roman" w:hAnsi="Times New Roman" w:cs="Times New Roman"/>
+          <w:b/>
+          <w:kern w:val="0"/>
+          <w:lang w:val="es-ES_tradnl" w:eastAsia="es-ES_tradnl"/>
+          <w14:ligatures w14:val="none"/>
+        </w:rPr>
+        <w:t xml:space="preserve"/>
+      </w:r>
+      <w:r>
+        <w:rPr>
+          <w:rFonts w:ascii="Times New Roman" w:eastAsia="Times New Roman" w:hAnsi="Times New Roman" w:cs="Times New Roman"/>
+          <w:b/>
+          <w:kern w:val="0"/>
+          <w:lang w:val="es-ES_tradnl" w:eastAsia="es-ES_tradnl"/>
+          <w14:ligatures w14:val="none"/>
+        </w:rPr>
+        <w:t xml:space="preserve"/>
       </w:r>
     </w:p>
     <w:p>

</xml_diff>